<commit_message>
feat: initialize Stock Market Analyzer dashboard with interactive charting, market scanning, and data visualization components
</commit_message>
<xml_diff>
--- a/my-work/class-02C/Class 02c notes.docx
+++ b/my-work/class-02C/Class 02c notes.docx
@@ -7,10 +7,916 @@
         <w:t>Class 02c notes</w:t>
       </w:r>
     </w:p>
+    <w:p>
+      <w:r>
+        <w:t>.</w:t>
+      </w:r>
+      <w:proofErr w:type="spellStart"/>
+      <w:r>
+        <w:t>venv</w:t>
+      </w:r>
+      <w:proofErr w:type="spellEnd"/>
+      <w:r>
+        <w:t>\Scripts\Activate.ps1</w:t>
+      </w:r>
+    </w:p>
     <w:p/>
     <w:p>
       <w:r>
         <w:t>&amp; "C:\Users\Lalit.MSI\google-cloud-sdk\google-cloud-sdk\bin\gcloud.cmd" auth application-default login</w:t>
+      </w:r>
+    </w:p>
+    <w:p/>
+    <w:p/>
+    <w:p>
+      <w:proofErr w:type="spellStart"/>
+      <w:r>
+        <w:t>gcloud</w:t>
+      </w:r>
+      <w:proofErr w:type="spellEnd"/>
+      <w:r>
+        <w:t xml:space="preserve"> auth application-default print-access-token &gt;/dev/null \ &amp;&amp; echo "Application Default Credentials: OK"</w:t>
+      </w:r>
+    </w:p>
+    <w:p>
+      <w:r>
+        <w:t>curl.exe -</w:t>
+      </w:r>
+      <w:proofErr w:type="spellStart"/>
+      <w:r>
+        <w:t>sS</w:t>
+      </w:r>
+      <w:proofErr w:type="spellEnd"/>
+      <w:r>
+        <w:t xml:space="preserve"> http://127.0.0.1:8000/list-apps | </w:t>
+      </w:r>
+      <w:proofErr w:type="spellStart"/>
+      <w:proofErr w:type="gramStart"/>
+      <w:r>
+        <w:t>jq</w:t>
+      </w:r>
+      <w:proofErr w:type="spellEnd"/>
+      <w:r>
+        <w:t xml:space="preserve"> .</w:t>
+      </w:r>
+      <w:proofErr w:type="gramEnd"/>
+    </w:p>
+    <w:p>
+      <w:r>
+        <w:t>alternate</w:t>
+      </w:r>
+    </w:p>
+    <w:p>
+      <w:r>
+        <w:t>Invoke-</w:t>
+      </w:r>
+      <w:proofErr w:type="spellStart"/>
+      <w:r>
+        <w:t>RestMethod</w:t>
+      </w:r>
+      <w:proofErr w:type="spellEnd"/>
+      <w:r>
+        <w:t xml:space="preserve"> -Uri "http://127.0.0.1:8000/list-apps" | </w:t>
+      </w:r>
+      <w:proofErr w:type="spellStart"/>
+      <w:r>
+        <w:t>ConvertTo</w:t>
+      </w:r>
+      <w:proofErr w:type="spellEnd"/>
+      <w:r>
+        <w:t>-Json</w:t>
+      </w:r>
+    </w:p>
+    <w:p/>
+    <w:p>
+      <w:r>
+        <w:t>Get-</w:t>
+      </w:r>
+      <w:proofErr w:type="spellStart"/>
+      <w:r>
+        <w:t>ChildItem</w:t>
+      </w:r>
+      <w:proofErr w:type="spellEnd"/>
+      <w:r>
+        <w:t xml:space="preserve"> class-02C-work/run-01.json, class-02C-work/run-02.json, class-02C-work/</w:t>
+      </w:r>
+      <w:proofErr w:type="spellStart"/>
+      <w:r>
+        <w:t>session.json</w:t>
+      </w:r>
+      <w:proofErr w:type="spellEnd"/>
+      <w:r>
+        <w:t>, class-02C-work/</w:t>
+      </w:r>
+      <w:proofErr w:type="spellStart"/>
+      <w:r>
+        <w:t>events.jsonl</w:t>
+      </w:r>
+      <w:proofErr w:type="spellEnd"/>
+      <w:r>
+        <w:t xml:space="preserve"> | Format-Table Name, Length, </w:t>
+      </w:r>
+      <w:proofErr w:type="spellStart"/>
+      <w:r>
+        <w:t>LastWriteTime</w:t>
+      </w:r>
+      <w:proofErr w:type="spellEnd"/>
+    </w:p>
+    <w:p/>
+    <w:p>
+      <w:r>
+        <w:t>(Get-Content class-02C-work/</w:t>
+      </w:r>
+      <w:proofErr w:type="spellStart"/>
+      <w:r>
+        <w:t>events.jsonl</w:t>
+      </w:r>
+      <w:proofErr w:type="spellEnd"/>
+      <w:proofErr w:type="gramStart"/>
+      <w:r>
+        <w:t>).Count</w:t>
+      </w:r>
+      <w:proofErr w:type="gramEnd"/>
+    </w:p>
+    <w:p>
+      <w:r>
+        <w:t>jq.exe -s 'length' class-02C-work/</w:t>
+      </w:r>
+      <w:proofErr w:type="spellStart"/>
+      <w:r>
+        <w:t>events.jsonl</w:t>
+      </w:r>
+      <w:proofErr w:type="spellEnd"/>
+    </w:p>
+    <w:p/>
+    <w:p>
+      <w:r>
+        <w:t>Get-</w:t>
+      </w:r>
+      <w:proofErr w:type="spellStart"/>
+      <w:r>
+        <w:t>ChildItem</w:t>
+      </w:r>
+      <w:proofErr w:type="spellEnd"/>
+      <w:r>
+        <w:t xml:space="preserve"> </w:t>
+      </w:r>
+      <w:proofErr w:type="spellStart"/>
+      <w:r>
+        <w:t>movie_pitches</w:t>
+      </w:r>
+      <w:proofErr w:type="spellEnd"/>
+      <w:r>
+        <w:t xml:space="preserve"> -File | Format-Table Name, Length, </w:t>
+      </w:r>
+      <w:proofErr w:type="spellStart"/>
+      <w:r>
+        <w:t>LastWriteTime</w:t>
+      </w:r>
+      <w:proofErr w:type="spellEnd"/>
+    </w:p>
+    <w:p/>
+    <w:p>
+      <w:r>
+        <w:t>Write-Output "</w:t>
+      </w:r>
+      <w:proofErr w:type="spellStart"/>
+      <w:r>
+        <w:t>SEQ`tTIME`tAUTHOR`tPART</w:t>
+      </w:r>
+      <w:proofErr w:type="spellEnd"/>
+      <w:r>
+        <w:t xml:space="preserve"> </w:t>
+      </w:r>
+      <w:proofErr w:type="spellStart"/>
+      <w:r>
+        <w:t>TYPES`tSTATE</w:t>
+      </w:r>
+      <w:proofErr w:type="spellEnd"/>
+      <w:r>
+        <w:t xml:space="preserve"> KEYS"</w:t>
+      </w:r>
+    </w:p>
+    <w:p>
+      <w:r>
+        <w:t>jq.exe -</w:t>
+      </w:r>
+      <w:proofErr w:type="spellStart"/>
+      <w:r>
+        <w:t>rs</w:t>
+      </w:r>
+      <w:proofErr w:type="spellEnd"/>
+      <w:r>
+        <w:t xml:space="preserve"> '</w:t>
+      </w:r>
+      <w:proofErr w:type="spellStart"/>
+      <w:r>
+        <w:t>to_</w:t>
+      </w:r>
+      <w:proofErr w:type="gramStart"/>
+      <w:r>
+        <w:t>entries</w:t>
+      </w:r>
+      <w:proofErr w:type="spellEnd"/>
+      <w:r>
+        <w:t>[</w:t>
+      </w:r>
+      <w:proofErr w:type="gramEnd"/>
+      <w:r>
+        <w:t>] | .key as $index | .value | (</w:t>
+      </w:r>
+      <w:proofErr w:type="gramStart"/>
+      <w:r>
+        <w:t>[.</w:t>
+      </w:r>
+      <w:proofErr w:type="spellStart"/>
+      <w:r>
+        <w:t>content</w:t>
+      </w:r>
+      <w:proofErr w:type="gramEnd"/>
+      <w:r>
+        <w:t>.</w:t>
+      </w:r>
+      <w:proofErr w:type="gramStart"/>
+      <w:r>
+        <w:t>parts</w:t>
+      </w:r>
+      <w:proofErr w:type="spellEnd"/>
+      <w:r>
+        <w:t>[</w:t>
+      </w:r>
+      <w:proofErr w:type="gramEnd"/>
+      <w:r>
+        <w:t xml:space="preserve">]? | </w:t>
+      </w:r>
+      <w:proofErr w:type="gramStart"/>
+      <w:r>
+        <w:t>keys[</w:t>
+      </w:r>
+      <w:proofErr w:type="gramEnd"/>
+      <w:r>
+        <w:t xml:space="preserve">]] | unique | </w:t>
+      </w:r>
+      <w:proofErr w:type="gramStart"/>
+      <w:r>
+        <w:t>join(</w:t>
+      </w:r>
+      <w:proofErr w:type="gramEnd"/>
+      <w:r>
+        <w:t>\</w:t>
+      </w:r>
+      <w:proofErr w:type="gramStart"/>
+      <w:r>
+        <w:t>",\</w:t>
+      </w:r>
+      <w:proofErr w:type="gramEnd"/>
+      <w:r>
+        <w:t>")) as $parts | (</w:t>
+      </w:r>
+      <w:proofErr w:type="gramStart"/>
+      <w:r>
+        <w:t>(.</w:t>
+      </w:r>
+      <w:proofErr w:type="spellStart"/>
+      <w:r>
+        <w:t>actions</w:t>
+      </w:r>
+      <w:proofErr w:type="gramEnd"/>
+      <w:r>
+        <w:t>.stateDelta</w:t>
+      </w:r>
+      <w:proofErr w:type="spellEnd"/>
+      <w:r>
+        <w:t xml:space="preserve"> // {}) | keys | </w:t>
+      </w:r>
+      <w:proofErr w:type="gramStart"/>
+      <w:r>
+        <w:t>join(</w:t>
+      </w:r>
+      <w:proofErr w:type="gramEnd"/>
+      <w:r>
+        <w:t>\</w:t>
+      </w:r>
+      <w:proofErr w:type="gramStart"/>
+      <w:r>
+        <w:t>",\</w:t>
+      </w:r>
+      <w:proofErr w:type="gramEnd"/>
+      <w:r>
+        <w:t xml:space="preserve">")) as $state | [($index + 1), </w:t>
+      </w:r>
+      <w:proofErr w:type="gramStart"/>
+      <w:r>
+        <w:t>(.timestamp</w:t>
+      </w:r>
+      <w:proofErr w:type="gramEnd"/>
+      <w:r>
+        <w:t xml:space="preserve"> // \"\"), </w:t>
+      </w:r>
+      <w:proofErr w:type="gramStart"/>
+      <w:r>
+        <w:t>(.author</w:t>
+      </w:r>
+      <w:proofErr w:type="gramEnd"/>
+      <w:r>
+        <w:t xml:space="preserve"> // \"unknown\"), (if $parts == \"\" then \"event\" else $parts end), (if $state == \"\" then \"-\" else $state end)] | @tsv' class-02C-work/</w:t>
+      </w:r>
+      <w:proofErr w:type="spellStart"/>
+      <w:r>
+        <w:t>events.jsonl</w:t>
+      </w:r>
+      <w:proofErr w:type="spellEnd"/>
+    </w:p>
+    <w:p>
+      <w:r>
+        <w:t>Get-Content class-02C-work/</w:t>
+      </w:r>
+      <w:proofErr w:type="spellStart"/>
+      <w:r>
+        <w:t>events.jsonl</w:t>
+      </w:r>
+      <w:proofErr w:type="spellEnd"/>
+      <w:r>
+        <w:t xml:space="preserve"> -</w:t>
+      </w:r>
+      <w:proofErr w:type="spellStart"/>
+      <w:r>
+        <w:t>TotalCount</w:t>
+      </w:r>
+      <w:proofErr w:type="spellEnd"/>
+      <w:r>
+        <w:t xml:space="preserve"> 1 | </w:t>
+      </w:r>
+      <w:proofErr w:type="gramStart"/>
+      <w:r>
+        <w:t>jq.exe .</w:t>
+      </w:r>
+      <w:proofErr w:type="gramEnd"/>
+    </w:p>
+    <w:p/>
+    <w:p>
+      <w:r>
+        <w:lastRenderedPageBreak/>
+        <w:t>Task 9</w:t>
+      </w:r>
+    </w:p>
+    <w:p>
+      <w:r>
+        <w:t>.</w:t>
+      </w:r>
+      <w:proofErr w:type="spellStart"/>
+      <w:r>
+        <w:t>venv</w:t>
+      </w:r>
+      <w:proofErr w:type="spellEnd"/>
+      <w:r>
+        <w:t>\Scripts\python.exe -c "</w:t>
+      </w:r>
+    </w:p>
+    <w:p>
+      <w:r>
+        <w:t xml:space="preserve">import </w:t>
+      </w:r>
+      <w:proofErr w:type="spellStart"/>
+      <w:r>
+        <w:t>json</w:t>
+      </w:r>
+      <w:proofErr w:type="spellEnd"/>
+      <w:r>
+        <w:t>, time, sys</w:t>
+      </w:r>
+    </w:p>
+    <w:p>
+      <w:r>
+        <w:t>delay = 0.75</w:t>
+      </w:r>
+    </w:p>
+    <w:p>
+      <w:r>
+        <w:t xml:space="preserve">with </w:t>
+      </w:r>
+      <w:proofErr w:type="gramStart"/>
+      <w:r>
+        <w:t>open(</w:t>
+      </w:r>
+      <w:proofErr w:type="gramEnd"/>
+      <w:r>
+        <w:t>'class-02C-work/</w:t>
+      </w:r>
+      <w:proofErr w:type="spellStart"/>
+      <w:r>
+        <w:t>events.jsonl</w:t>
+      </w:r>
+      <w:proofErr w:type="spellEnd"/>
+      <w:r>
+        <w:t>', 'r', encoding='utf-8') as f:</w:t>
+      </w:r>
+    </w:p>
+    <w:p>
+      <w:r>
+        <w:t xml:space="preserve">    for line in f:</w:t>
+      </w:r>
+    </w:p>
+    <w:p>
+      <w:r>
+        <w:t xml:space="preserve">        if not </w:t>
+      </w:r>
+      <w:proofErr w:type="spellStart"/>
+      <w:proofErr w:type="gramStart"/>
+      <w:r>
+        <w:t>line.strip</w:t>
+      </w:r>
+      <w:proofErr w:type="spellEnd"/>
+      <w:proofErr w:type="gramEnd"/>
+      <w:r>
+        <w:t>(): continue</w:t>
+      </w:r>
+    </w:p>
+    <w:p>
+      <w:r>
+        <w:t xml:space="preserve">        event = </w:t>
+      </w:r>
+      <w:proofErr w:type="spellStart"/>
+      <w:proofErr w:type="gramStart"/>
+      <w:r>
+        <w:t>json.loads</w:t>
+      </w:r>
+      <w:proofErr w:type="spellEnd"/>
+      <w:proofErr w:type="gramEnd"/>
+      <w:r>
+        <w:t>(line)</w:t>
+      </w:r>
+    </w:p>
+    <w:p>
+      <w:r>
+        <w:t xml:space="preserve">        author = </w:t>
+      </w:r>
+      <w:proofErr w:type="spellStart"/>
+      <w:r>
+        <w:t>event.get</w:t>
+      </w:r>
+      <w:proofErr w:type="spellEnd"/>
+      <w:r>
+        <w:t>('author') or 'unknown'</w:t>
+      </w:r>
+    </w:p>
+    <w:p>
+      <w:r>
+        <w:t xml:space="preserve">        parts = </w:t>
+      </w:r>
+      <w:proofErr w:type="spellStart"/>
+      <w:proofErr w:type="gramStart"/>
+      <w:r>
+        <w:t>event.get</w:t>
+      </w:r>
+      <w:proofErr w:type="spellEnd"/>
+      <w:r>
+        <w:t>(</w:t>
+      </w:r>
+      <w:proofErr w:type="gramEnd"/>
+      <w:r>
+        <w:t>'content', {}</w:t>
+      </w:r>
+      <w:proofErr w:type="gramStart"/>
+      <w:r>
+        <w:t>).get</w:t>
+      </w:r>
+      <w:proofErr w:type="gramEnd"/>
+      <w:r>
+        <w:t>('parts', [])</w:t>
+      </w:r>
+    </w:p>
+    <w:p>
+      <w:r>
+        <w:t xml:space="preserve">        </w:t>
+      </w:r>
+      <w:proofErr w:type="spellStart"/>
+      <w:r>
+        <w:t>part_keys</w:t>
+      </w:r>
+      <w:proofErr w:type="spellEnd"/>
+      <w:r>
+        <w:t xml:space="preserve"> = </w:t>
+      </w:r>
+      <w:proofErr w:type="gramStart"/>
+      <w:r>
+        <w:t>sorted(list(set(</w:t>
+      </w:r>
+      <w:proofErr w:type="gramEnd"/>
+      <w:r>
+        <w:t xml:space="preserve">k for part in parts for k in </w:t>
+      </w:r>
+      <w:proofErr w:type="spellStart"/>
+      <w:proofErr w:type="gramStart"/>
+      <w:r>
+        <w:t>part.keys</w:t>
+      </w:r>
+      <w:proofErr w:type="spellEnd"/>
+      <w:proofErr w:type="gramEnd"/>
+      <w:r>
+        <w:t>())))</w:t>
+      </w:r>
+    </w:p>
+    <w:p>
+      <w:r>
+        <w:t xml:space="preserve">        </w:t>
+      </w:r>
+      <w:proofErr w:type="spellStart"/>
+      <w:r>
+        <w:t>parts_str</w:t>
+      </w:r>
+      <w:proofErr w:type="spellEnd"/>
+      <w:r>
+        <w:t xml:space="preserve"> = ',</w:t>
+      </w:r>
+      <w:proofErr w:type="gramStart"/>
+      <w:r>
+        <w:t>'.join</w:t>
+      </w:r>
+      <w:proofErr w:type="gramEnd"/>
+      <w:r>
+        <w:t>(</w:t>
+      </w:r>
+      <w:proofErr w:type="spellStart"/>
+      <w:r>
+        <w:t>part_keys</w:t>
+      </w:r>
+      <w:proofErr w:type="spellEnd"/>
+      <w:r>
+        <w:t xml:space="preserve">) if </w:t>
+      </w:r>
+      <w:proofErr w:type="spellStart"/>
+      <w:r>
+        <w:t>part_keys</w:t>
+      </w:r>
+      <w:proofErr w:type="spellEnd"/>
+      <w:r>
+        <w:t xml:space="preserve"> else 'event'</w:t>
+      </w:r>
+    </w:p>
+    <w:p>
+      <w:r>
+        <w:t xml:space="preserve">        print(f'[{author}] {</w:t>
+      </w:r>
+      <w:proofErr w:type="spellStart"/>
+      <w:r>
+        <w:t>parts_str</w:t>
+      </w:r>
+      <w:proofErr w:type="spellEnd"/>
+      <w:r>
+        <w:t>}')</w:t>
+      </w:r>
+    </w:p>
+    <w:p>
+      <w:r>
+        <w:t xml:space="preserve">        </w:t>
+      </w:r>
+      <w:proofErr w:type="spellStart"/>
+      <w:proofErr w:type="gramStart"/>
+      <w:r>
+        <w:t>sys.stdout</w:t>
+      </w:r>
+      <w:proofErr w:type="gramEnd"/>
+      <w:r>
+        <w:t>.</w:t>
+      </w:r>
+      <w:proofErr w:type="gramStart"/>
+      <w:r>
+        <w:t>flush</w:t>
+      </w:r>
+      <w:proofErr w:type="spellEnd"/>
+      <w:r>
+        <w:t>(</w:t>
+      </w:r>
+      <w:proofErr w:type="gramEnd"/>
+      <w:r>
+        <w:t>)</w:t>
+      </w:r>
+    </w:p>
+    <w:p>
+      <w:r>
+        <w:t xml:space="preserve">        </w:t>
+      </w:r>
+      <w:proofErr w:type="spellStart"/>
+      <w:proofErr w:type="gramStart"/>
+      <w:r>
+        <w:t>time.sleep</w:t>
+      </w:r>
+      <w:proofErr w:type="spellEnd"/>
+      <w:proofErr w:type="gramEnd"/>
+      <w:r>
+        <w:t>(delay)</w:t>
+      </w:r>
+    </w:p>
+    <w:p>
+      <w:r>
+        <w:t>"</w:t>
+      </w:r>
+    </w:p>
+    <w:p>
+      <w:r>
+        <w:t>b) delay .2</w:t>
+      </w:r>
+    </w:p>
+    <w:p>
+      <w:r>
+        <w:t>.</w:t>
+      </w:r>
+      <w:proofErr w:type="spellStart"/>
+      <w:r>
+        <w:t>venv</w:t>
+      </w:r>
+      <w:proofErr w:type="spellEnd"/>
+      <w:r>
+        <w:t>\Scripts\python.exe -c "</w:t>
+      </w:r>
+    </w:p>
+    <w:p>
+      <w:r>
+        <w:t xml:space="preserve">import </w:t>
+      </w:r>
+      <w:proofErr w:type="spellStart"/>
+      <w:r>
+        <w:t>json</w:t>
+      </w:r>
+      <w:proofErr w:type="spellEnd"/>
+      <w:r>
+        <w:t>, time, sys</w:t>
+      </w:r>
+    </w:p>
+    <w:p>
+      <w:r>
+        <w:t>delay = 0.2</w:t>
+      </w:r>
+    </w:p>
+    <w:p>
+      <w:r>
+        <w:t xml:space="preserve">with </w:t>
+      </w:r>
+      <w:proofErr w:type="gramStart"/>
+      <w:r>
+        <w:t>open(</w:t>
+      </w:r>
+      <w:proofErr w:type="gramEnd"/>
+      <w:r>
+        <w:t>'class-02C-work/</w:t>
+      </w:r>
+      <w:proofErr w:type="spellStart"/>
+      <w:r>
+        <w:t>events.jsonl</w:t>
+      </w:r>
+      <w:proofErr w:type="spellEnd"/>
+      <w:r>
+        <w:t>', 'r', encoding='utf-8') as f:</w:t>
+      </w:r>
+    </w:p>
+    <w:p>
+      <w:r>
+        <w:t xml:space="preserve">    for line in f:</w:t>
+      </w:r>
+    </w:p>
+    <w:p>
+      <w:r>
+        <w:t xml:space="preserve">        if not </w:t>
+      </w:r>
+      <w:proofErr w:type="spellStart"/>
+      <w:proofErr w:type="gramStart"/>
+      <w:r>
+        <w:t>line.strip</w:t>
+      </w:r>
+      <w:proofErr w:type="spellEnd"/>
+      <w:proofErr w:type="gramEnd"/>
+      <w:r>
+        <w:t>(): continue</w:t>
+      </w:r>
+    </w:p>
+    <w:p>
+      <w:r>
+        <w:t xml:space="preserve">        event = </w:t>
+      </w:r>
+      <w:proofErr w:type="spellStart"/>
+      <w:proofErr w:type="gramStart"/>
+      <w:r>
+        <w:t>json.loads</w:t>
+      </w:r>
+      <w:proofErr w:type="spellEnd"/>
+      <w:proofErr w:type="gramEnd"/>
+      <w:r>
+        <w:t>(line)</w:t>
+      </w:r>
+    </w:p>
+    <w:p>
+      <w:r>
+        <w:t xml:space="preserve">        author = </w:t>
+      </w:r>
+      <w:proofErr w:type="spellStart"/>
+      <w:r>
+        <w:t>event.get</w:t>
+      </w:r>
+      <w:proofErr w:type="spellEnd"/>
+      <w:r>
+        <w:t>('author') or 'unknown'</w:t>
+      </w:r>
+    </w:p>
+    <w:p>
+      <w:r>
+        <w:t xml:space="preserve">        parts = </w:t>
+      </w:r>
+      <w:proofErr w:type="spellStart"/>
+      <w:proofErr w:type="gramStart"/>
+      <w:r>
+        <w:t>event.get</w:t>
+      </w:r>
+      <w:proofErr w:type="spellEnd"/>
+      <w:r>
+        <w:t>(</w:t>
+      </w:r>
+      <w:proofErr w:type="gramEnd"/>
+      <w:r>
+        <w:t>'content', {}</w:t>
+      </w:r>
+      <w:proofErr w:type="gramStart"/>
+      <w:r>
+        <w:t>).get</w:t>
+      </w:r>
+      <w:proofErr w:type="gramEnd"/>
+      <w:r>
+        <w:t>('parts', [])</w:t>
+      </w:r>
+    </w:p>
+    <w:p>
+      <w:r>
+        <w:lastRenderedPageBreak/>
+        <w:t xml:space="preserve">        </w:t>
+      </w:r>
+      <w:proofErr w:type="spellStart"/>
+      <w:r>
+        <w:t>part_keys</w:t>
+      </w:r>
+      <w:proofErr w:type="spellEnd"/>
+      <w:r>
+        <w:t xml:space="preserve"> = </w:t>
+      </w:r>
+      <w:proofErr w:type="gramStart"/>
+      <w:r>
+        <w:t>sorted(list(set(</w:t>
+      </w:r>
+      <w:proofErr w:type="gramEnd"/>
+      <w:r>
+        <w:t xml:space="preserve">k for part in parts for k in </w:t>
+      </w:r>
+      <w:proofErr w:type="spellStart"/>
+      <w:proofErr w:type="gramStart"/>
+      <w:r>
+        <w:t>part.keys</w:t>
+      </w:r>
+      <w:proofErr w:type="spellEnd"/>
+      <w:proofErr w:type="gramEnd"/>
+      <w:r>
+        <w:t>())))</w:t>
+      </w:r>
+    </w:p>
+    <w:p>
+      <w:r>
+        <w:t xml:space="preserve">        </w:t>
+      </w:r>
+      <w:proofErr w:type="spellStart"/>
+      <w:r>
+        <w:t>parts_str</w:t>
+      </w:r>
+      <w:proofErr w:type="spellEnd"/>
+      <w:r>
+        <w:t xml:space="preserve"> = ',</w:t>
+      </w:r>
+      <w:proofErr w:type="gramStart"/>
+      <w:r>
+        <w:t>'.join</w:t>
+      </w:r>
+      <w:proofErr w:type="gramEnd"/>
+      <w:r>
+        <w:t>(</w:t>
+      </w:r>
+      <w:proofErr w:type="spellStart"/>
+      <w:r>
+        <w:t>part_keys</w:t>
+      </w:r>
+      <w:proofErr w:type="spellEnd"/>
+      <w:r>
+        <w:t xml:space="preserve">) if </w:t>
+      </w:r>
+      <w:proofErr w:type="spellStart"/>
+      <w:r>
+        <w:t>part_keys</w:t>
+      </w:r>
+      <w:proofErr w:type="spellEnd"/>
+      <w:r>
+        <w:t xml:space="preserve"> else 'event'</w:t>
+      </w:r>
+    </w:p>
+    <w:p>
+      <w:r>
+        <w:t xml:space="preserve">        print(f'[{author}] {</w:t>
+      </w:r>
+      <w:proofErr w:type="spellStart"/>
+      <w:r>
+        <w:t>parts_str</w:t>
+      </w:r>
+      <w:proofErr w:type="spellEnd"/>
+      <w:r>
+        <w:t>}')</w:t>
+      </w:r>
+    </w:p>
+    <w:p>
+      <w:r>
+        <w:t xml:space="preserve">        </w:t>
+      </w:r>
+      <w:proofErr w:type="spellStart"/>
+      <w:proofErr w:type="gramStart"/>
+      <w:r>
+        <w:t>sys.stdout</w:t>
+      </w:r>
+      <w:proofErr w:type="gramEnd"/>
+      <w:r>
+        <w:t>.</w:t>
+      </w:r>
+      <w:proofErr w:type="gramStart"/>
+      <w:r>
+        <w:t>flush</w:t>
+      </w:r>
+      <w:proofErr w:type="spellEnd"/>
+      <w:r>
+        <w:t>(</w:t>
+      </w:r>
+      <w:proofErr w:type="gramEnd"/>
+      <w:r>
+        <w:t>)</w:t>
+      </w:r>
+    </w:p>
+    <w:p>
+      <w:r>
+        <w:t xml:space="preserve">        </w:t>
+      </w:r>
+      <w:proofErr w:type="spellStart"/>
+      <w:proofErr w:type="gramStart"/>
+      <w:r>
+        <w:t>time.sleep</w:t>
+      </w:r>
+      <w:proofErr w:type="spellEnd"/>
+      <w:proofErr w:type="gramEnd"/>
+      <w:r>
+        <w:t>(delay)</w:t>
+      </w:r>
+    </w:p>
+    <w:p>
+      <w:r>
+        <w:t>"</w:t>
+      </w:r>
+    </w:p>
+    <w:p>
+      <w:r>
+        <w:t xml:space="preserve">jq.exe -r </w:t>
+      </w:r>
+      <w:proofErr w:type="gramStart"/>
+      <w:r>
+        <w:t>'.author</w:t>
+      </w:r>
+      <w:proofErr w:type="gramEnd"/>
+      <w:r>
+        <w:t xml:space="preserve"> // \"unknown\"' class-02C-work/</w:t>
+      </w:r>
+      <w:proofErr w:type="spellStart"/>
+      <w:r>
+        <w:t>events.jsonl</w:t>
+      </w:r>
+      <w:proofErr w:type="spellEnd"/>
+      <w:r>
+        <w:t xml:space="preserve"> | Sort-Object -Unique</w:t>
+      </w:r>
+    </w:p>
+    <w:p>
+      <w:r>
+        <w:t>12</w:t>
+      </w:r>
+    </w:p>
+    <w:p>
+      <w:r>
+        <w:t>.</w:t>
+      </w:r>
+      <w:proofErr w:type="spellStart"/>
+      <w:r>
+        <w:t>venv</w:t>
+      </w:r>
+      <w:proofErr w:type="spellEnd"/>
+      <w:r>
+        <w:t>\Scripts\python.exe class-02C-work/replay_events.py class-02C-work/</w:t>
+      </w:r>
+      <w:proofErr w:type="spellStart"/>
+      <w:r>
+        <w:t>events.jsonl</w:t>
+      </w:r>
+      <w:proofErr w:type="spellEnd"/>
+      <w:r>
+        <w:t xml:space="preserve"> --dry-run</w:t>
       </w:r>
     </w:p>
     <w:sectPr>

</xml_diff>